<commit_message>
fix: update master.docx evaluation sheet layout and paragraph alignment
</commit_message>
<xml_diff>
--- a/master.docx
+++ b/master.docx
@@ -5354,12 +5354,7 @@
               </w:rPr>
             </w:pPr>
             <w:r>
-              <w:rPr>
-                <w:color w:val="000000"/>
-                <w:sz w:val="23"/>
-                <w:szCs w:val="23"/>
-              </w:rPr>
-              <w:t>- Thực hiện nghiệp túc các buổi họp lớp/ sinh hoạt đoàn thể do Học viện/Khoa/Viện, CVHT, Lớp/Chi đoàn tổ chức (tùy thuộc vào số buổi tổ chức sinh hoạt, họp)</w:t>
+              <w:t>- Thực hiện nghiêm túc các buổi họp lớp/ sinh hoạt đoàn thể do Học viện/Khoa/Viện, CVHT, Lớp/Chi đoàn tổ chức (tùy thuộc vào số buổi tổ chức sinh hoạt, họp)</w:t>
             </w:r>
           </w:p>
         </w:tc>

</xml_diff>